<commit_message>
Add master resume upload and removal safeguards; update version 14 guides
</commit_message>
<xml_diff>
--- a/docs/Le_Resume_Studio_Developer_Guide.docx
+++ b/docs/Le_Resume_Studio_Developer_Guide.docx
@@ -20,7 +20,7 @@
     </w:p>
     <w:p>
       <w:r>
-        <w:t>October 11 2026  |  Published app version 13</w:t>
+        <w:t>October 12 2026  |  Published app version 14</w:t>
       </w:r>
     </w:p>
     <w:p>
@@ -390,7 +390,7 @@
                 <w:color w:val="000000"/>
                 <w:sz w:val="21"/>
               </w:rPr>
-              <w:t>docx.js writes DOCX files; pdf-lib.min.js writes PDFs. Nimbus Sans font assets support the PDF layout.</w:t>
+              <w:t>docx.js writes DOCX files; pdf-lib.min.js writes PDFs. Nimbus Sans font assets support the PDF layout. JSZip 3.10.1 reads DOCX; PDF.js 5.6.205 extracts PDF text. Reader assets and licenses are served locally.</w:t>
             </w:r>
           </w:p>
         </w:tc>
@@ -528,7 +528,7 @@
                 <w:color w:val="000000"/>
                 <w:sz w:val="21"/>
               </w:rPr>
-              <w:t>Neither is used by the app runtime. Python is optional for a local static server or external document QA. No Java backend or native Android project is present.</w:t>
+              <w:t>Neither is used by the app runtime. Python builds these guides with python-docx and can run a local static server or document QA. No Java backend or native Android project is present.</w:t>
             </w:r>
           </w:p>
         </w:tc>
@@ -858,6 +858,75 @@
                 <w:sz w:val="21"/>
               </w:rPr>
               <w:t>createBlankMaster factory. Published data contains no personal resume seed.</w:t>
+            </w:r>
+          </w:p>
+        </w:tc>
+      </w:tr>
+      <w:tr>
+        <w:trPr>
+          <w:cantSplit/>
+        </w:trPr>
+        <w:tc>
+          <w:tcPr>
+            <w:tcW w:type="dxa" w:w="3816"/>
+            <w:vAlign w:val="center"/>
+            <w:tcMar>
+              <w:top w:w="85" w:type="dxa"/>
+              <w:left w:w="110" w:type="dxa"/>
+              <w:bottom w:w="85" w:type="dxa"/>
+              <w:right w:w="110" w:type="dxa"/>
+            </w:tcMar>
+            <w:tcBorders>
+              <w:top w:val="single" w:sz="4" w:color="D0D0D0"/>
+              <w:left w:val="single" w:sz="4" w:color="D0D0D0"/>
+              <w:bottom w:val="single" w:sz="4" w:color="D0D0D0"/>
+              <w:right w:val="single" w:sz="4" w:color="D0D0D0"/>
+            </w:tcBorders>
+          </w:tcPr>
+          <w:p>
+            <w:pPr>
+              <w:spacing w:before="0" w:after="0" w:line="254" w:lineRule="auto"/>
+            </w:pPr>
+            <w:r>
+              <w:rPr>
+                <w:rFonts w:ascii="Arial" w:hAnsi="Arial"/>
+                <w:b w:val="0"/>
+                <w:color w:val="000000"/>
+                <w:sz w:val="21"/>
+              </w:rPr>
+              <w:t>dist/imports.js</w:t>
+            </w:r>
+          </w:p>
+        </w:tc>
+        <w:tc>
+          <w:tcPr>
+            <w:tcW w:type="dxa" w:w="6264"/>
+            <w:vAlign w:val="center"/>
+            <w:tcMar>
+              <w:top w:w="85" w:type="dxa"/>
+              <w:left w:w="110" w:type="dxa"/>
+              <w:bottom w:w="85" w:type="dxa"/>
+              <w:right w:w="110" w:type="dxa"/>
+            </w:tcMar>
+            <w:tcBorders>
+              <w:top w:val="single" w:sz="4" w:color="D0D0D0"/>
+              <w:left w:val="single" w:sz="4" w:color="D0D0D0"/>
+              <w:bottom w:val="single" w:sz="4" w:color="D0D0D0"/>
+              <w:right w:val="single" w:sz="4" w:color="D0D0D0"/>
+            </w:tcBorders>
+          </w:tcPr>
+          <w:p>
+            <w:pPr>
+              <w:spacing w:before="0" w:after="0" w:line="254" w:lineRule="auto"/>
+            </w:pPr>
+            <w:r>
+              <w:rPr>
+                <w:rFonts w:ascii="Arial" w:hAnsi="Arial"/>
+                <w:b w:val="0"/>
+                <w:color w:val="000000"/>
+                <w:sz w:val="21"/>
+              </w:rPr>
+              <w:t>Local file validation, DOCX/PDF/TXT text extraction, conservative draft parsing and cancellation.</w:t>
             </w:r>
           </w:p>
         </w:tc>
@@ -1651,7 +1720,7 @@
     </w:p>
     <w:p>
       <w:r>
-        <w:t>Master and resume objects are plain serializable data. A new factory returns empty strings and arrays, with source set to Blank master resume. The editor starts with one empty role and saves only after validating the required facts.</w:t>
+        <w:t>Master and resume objects are plain serializable data. A new factory returns empty strings and arrays, with source set to Blank master resume. The editor starts with one empty role and saves only after validating the required facts. Upload imports add source, importedText and importedFileName. The extracted text persists locally with the saved master and snapshots; Clear master removes it from the master, while saved versions remain until separately deleted.</w:t>
       </w:r>
     </w:p>
     <w:p>
@@ -2063,6 +2132,49 @@
     <w:p>
       <w:r>
         <w:t>Store records as JSON. cloneData uses structuredClone when available and a JSON clone fallback for these plain objects. Startup shape checks discard corrupt history entries and cap history at ten. Do not treat externally edited localStorage as trusted executable content.</w:t>
+      </w:r>
+    </w:p>
+    <w:p>
+      <w:pPr>
+        <w:pStyle w:val="Heading1"/>
+        <w:pageBreakBefore/>
+      </w:pPr>
+      <w:r>
+        <w:t>Master resume import interfaces</w:t>
+      </w:r>
+    </w:p>
+    <w:p>
+      <w:pPr>
+        <w:pStyle w:val="Code"/>
+      </w:pPr>
+      <w:r>
+        <w:t>validateResumeFile(file) -&gt; extension or throws</w:t>
+        <w:br/>
+        <w:t>extractResumeText(file, {signal, loadZip, loadPDF} = {})</w:t>
+        <w:br/>
+        <w:t xml:space="preserve">  -&gt; Promise&lt;string&gt;</w:t>
+        <w:br/>
+        <w:t>parseResumeText(text) -&gt; editable master draft</w:t>
+      </w:r>
+    </w:p>
+    <w:p>
+      <w:r>
+        <w:t>File validation accepts .pdf, .docx and .txt, with a 10 MB limit. UTF-8 TXT decoding rejects invalid encoding; DOCX uses JSZip and word/document.xml text with a 30 MB expanded archive limit. PDF.js extracts text from up to 30 pages, with evaluation disabled, local worker and standard fonts. No OCR is provided. Extracted text is capped at 200,000 characters; image-only or password-protected PDFs produce actionable errors.</w:t>
+      </w:r>
+    </w:p>
+    <w:p>
+      <w:r>
+        <w:t>Parsing recognizes common section headings and line-separated roles and education. It copies extracted facts into editable fields, leaves missing values blank and retains importedText for comparison. It does not infer qualifications or guarantee recognition of every layout. Review and explicit Save are required. A successful read replaces the unsaved draft; errors leave the existing draft and saved master intact.</w:t>
+      </w:r>
+    </w:p>
+    <w:p>
+      <w:r>
+        <w:t>app.js guards asynchronous reads with an epoch and AbortController. Clear, dialog close, cancellation and workspace reset invalidate pending imports; a late completion cannot restore deleted content. Save is disabled during import. The native labeled file input, polite progress, associated alert errors and review textarea preserve keyboard access. Tests exercise actual generated Word/PDF extraction and upload/save/clear behavior using fictional identifiers.</w:t>
+      </w:r>
+    </w:p>
+    <w:p>
+      <w:r>
+        <w:t>PDF.js and its worker must be served as JavaScript modules from dist/vendor/pdfjs; preserve standard_fonts and licenses. JSZip is loaded only for DOCX and PDF.js only for PDF. A failed reader load leaves manual entry and TXT available. Browser reading performs no resume-content network upload.</w:t>
       </w:r>
     </w:p>
     <w:p>
@@ -3268,7 +3380,7 @@
     </w:p>
     <w:p>
       <w:r>
-        <w:t>The blank-master implementation passed 100 node:test checks on October 11 2026. The final footer wording change also passed all 12 accessibility checks. Tests cover tailoring evidence, both document scores, English rules, actual export bytes, transfers, save failures, history deletion, reset guards, keyboard semantics, capability fallbacks, and seven fresh-master journeys. DOM adapters and capability simulations do not substitute for browser rendering or real ATS uploads.</w:t>
+        <w:t>The master-upload release passed 107 node:test checks on October 12 2026. Tests cover tailoring evidence, both document scores, English rules, actual export bytes, transfers, save failures, history deletion, reset guards, keyboard semantics, capability fallbacks, and seven fresh-master journeys. DOM adapters and capability simulations do not substitute for browser rendering or real ATS uploads.</w:t>
       </w:r>
     </w:p>
     <w:p>

</xml_diff>

<commit_message>
Preserve imported job bullets and headings; add local password protection and private downloads
</commit_message>
<xml_diff>
--- a/docs/Le_Resume_Studio_Developer_Guide.docx
+++ b/docs/Le_Resume_Studio_Developer_Guide.docx
@@ -20,7 +20,7 @@
     </w:p>
     <w:p>
       <w:r>
-        <w:t>October 12 2026  |  Published app version 14</w:t>
+        <w:t>October 12 2026  |  Published app version 15</w:t>
       </w:r>
     </w:p>
     <w:p>
@@ -719,7 +719,7 @@
                 <w:color w:val="000000"/>
                 <w:sz w:val="21"/>
               </w:rPr>
-              <w:t>Main page, input/output sections, six review tabs, seven dialogs, labels, and export controls.</w:t>
+              <w:t>Main page, input/output sections, six review tabs, eight dialogs, labels, and export controls.</w:t>
             </w:r>
           </w:p>
         </w:tc>
@@ -857,7 +857,76 @@
                 <w:color w:val="000000"/>
                 <w:sz w:val="21"/>
               </w:rPr>
-              <w:t>createBlankMaster factory. Published data contains no personal resume seed.</w:t>
+              <w:t>createBlankMaster and roleHeaderFields. Uploaded header order is retained; manual entry defaults to role/company/years.</w:t>
+            </w:r>
+          </w:p>
+        </w:tc>
+      </w:tr>
+      <w:tr>
+        <w:trPr>
+          <w:cantSplit/>
+        </w:trPr>
+        <w:tc>
+          <w:tcPr>
+            <w:tcW w:type="dxa" w:w="3816"/>
+            <w:vAlign w:val="center"/>
+            <w:tcMar>
+              <w:top w:w="85" w:type="dxa"/>
+              <w:left w:w="110" w:type="dxa"/>
+              <w:bottom w:w="85" w:type="dxa"/>
+              <w:right w:w="110" w:type="dxa"/>
+            </w:tcMar>
+            <w:tcBorders>
+              <w:top w:val="single" w:sz="4" w:color="D0D0D0"/>
+              <w:left w:val="single" w:sz="4" w:color="D0D0D0"/>
+              <w:bottom w:val="single" w:sz="4" w:color="D0D0D0"/>
+              <w:right w:val="single" w:sz="4" w:color="D0D0D0"/>
+            </w:tcBorders>
+          </w:tcPr>
+          <w:p>
+            <w:pPr>
+              <w:spacing w:before="0" w:after="0" w:line="254" w:lineRule="auto"/>
+            </w:pPr>
+            <w:r>
+              <w:rPr>
+                <w:rFonts w:ascii="Arial" w:hAnsi="Arial"/>
+                <w:b w:val="0"/>
+                <w:color w:val="000000"/>
+                <w:sz w:val="21"/>
+              </w:rPr>
+              <w:t>dist/privacy.js</w:t>
+            </w:r>
+          </w:p>
+        </w:tc>
+        <w:tc>
+          <w:tcPr>
+            <w:tcW w:type="dxa" w:w="6264"/>
+            <w:vAlign w:val="center"/>
+            <w:tcMar>
+              <w:top w:w="85" w:type="dxa"/>
+              <w:left w:w="110" w:type="dxa"/>
+              <w:bottom w:w="85" w:type="dxa"/>
+              <w:right w:w="110" w:type="dxa"/>
+            </w:tcMar>
+            <w:tcBorders>
+              <w:top w:val="single" w:sz="4" w:color="D0D0D0"/>
+              <w:left w:val="single" w:sz="4" w:color="D0D0D0"/>
+              <w:bottom w:val="single" w:sz="4" w:color="D0D0D0"/>
+              <w:right w:val="single" w:sz="4" w:color="D0D0D0"/>
+            </w:tcBorders>
+          </w:tcPr>
+          <w:p>
+            <w:pPr>
+              <w:spacing w:before="0" w:after="0" w:line="254" w:lineRule="auto"/>
+            </w:pPr>
+            <w:r>
+              <w:rPr>
+                <w:rFonts w:ascii="Arial" w:hAnsi="Arial"/>
+                <w:b w:val="0"/>
+                <w:color w:val="000000"/>
+                <w:sz w:val="21"/>
+              </w:rPr>
+              <w:t>Web Crypto password-derived encrypted vault, unlock, write queue and lock invalidation.</w:t>
             </w:r>
           </w:p>
         </w:tc>
@@ -1271,7 +1340,7 @@
                 <w:color w:val="000000"/>
                 <w:sz w:val="21"/>
               </w:rPr>
-              <w:t>Payload validation, filenames, Blob creation, URL-fragment transfer, save links, and optional file sharing.</w:t>
+              <w:t>Payload validation, filenames, Blob creation, private session transfer, save links, and optional file sharing.</w:t>
             </w:r>
           </w:p>
         </w:tc>
@@ -1706,7 +1775,7 @@
     </w:p>
     <w:p>
       <w:r>
-        <w:t>Both pages declare English, include a device-width viewport with zoom enabled, load the same three stylesheets in order, and use a module script. styles.css establishes the layout and visual system; accessibility.css overrides sizing, contrast, focus, and reflow; browser.css adds safe-area and keyboard viewport behavior. Preserve this order because later declarations intentionally override earlier rules.</w:t>
+        <w:t>Both pages declare English, allow viewport zoom, and load styles.css, accessibility.css and browser.css in that order. They use JavaScript modules. Preserve stylesheet order for layout, focus, contrast, reflow and mobile overrides.</w:t>
       </w:r>
     </w:p>
     <w:p>
@@ -2164,7 +2233,7 @@
     </w:p>
     <w:p>
       <w:r>
-        <w:t>Parsing recognizes common section headings and line-separated roles and education. It copies extracted facts into editable fields, leaves missing values blank and retains importedText for comparison. It does not infer qualifications or guarantee recognition of every layout. Review and explicit Save are required. A successful read replaces the unsaved draft; errors leave the existing draft and saved master intact.</w:t>
+        <w:t>Parsing recognizes common section headings and confirmed three-field employment headings. DOCX numbering retains bullet markers; PDF text is ordered by row and horizontal position. Until a complete next heading is found, text stays with the current role, including its final accomplishment. Roles retain headerOrder for preview, TXT, Word and PDF; manual entries default to title, employer, dates. It copies extracted facts into editable fields, leaves missing values blank and retains importedText for comparison. It does not infer qualifications or guarantee recognition of every layout. Review and explicit Save are required. A successful read replaces the unsaved draft; errors leave the existing draft and saved master intact.</w:t>
       </w:r>
     </w:p>
     <w:p>
@@ -2298,7 +2367,9 @@
         <w:br/>
         <w:t>decodeDownloadPayload(hash) -&gt; validated Payload</w:t>
         <w:br/>
-        <w:t>downloadPageUrl(payload) -&gt; URL string</w:t>
+        <w:t>downloadPageUrl(payload, host) -&gt; private URL string</w:t>
+        <w:br/>
+        <w:t>configurePrivateHandoff(link, payload, status, host) -&gt; cleanup</w:t>
         <w:br/>
         <w:t>readDownloadTransfer(host = globalThis) -&gt; Payload</w:t>
       </w:r>
@@ -2310,7 +2381,7 @@
     </w:p>
     <w:p>
       <w:r>
-        <w:t>Validation constrains supported formats, filename characters and extension, contact strings, arrays, and letter paragraphs. Cross-tab transfer uses UTF-8 JSON encoded as base64url in #document=. The raw transfer is capped at 600,000 bytes. The receiving page removes the fragment before decoding and stores the validated snapshot in sessionStorage for refresh. This is encoding, not encryption; a copied transfer URL can disclose its document.</w:t>
+        <w:t>Validation constrains supported formats, filename characters and extension, contact strings, arrays, and letter paragraphs. configurePrivateHandoff opens a same-origin tab on the user’s click. A 600,000-byte maximum snapshot is stored in sessionStorage under a random UUID for five minutes; only #transfer=UUID enters the URL. The opened tab inherits a copy of the source sessionStorage, consumes the transfer, clears its URL and retains the snapshot for refresh. The parent removes its transfer record. A copied URL in another session fails. Blocked popups or sessionStorage must offer direct save. Legacy encode/decode helpers remain internal serialization utilities and are not used in public links.</w:t>
       </w:r>
     </w:p>
     <w:p>
@@ -3317,7 +3388,7 @@
     </w:p>
     <w:p>
       <w:r>
-        <w:t>Load a shape-valid saved master. If none exists, recover only a valid snapshot from this browser’s history and persist it independently. An explicit blank marker prevents recovery after intentional master clearing. Otherwise use createBlankMaster. A new user therefore receives no applicant data. Master readiness controls whether tailoring is enabled.</w:t>
+        <w:t>When protection is off, load a valid saved master or recover this browser’s history snapshot. An explicit blank marker prevents recovery after clearing. A protected workspace starts blank until unlocked. Master readiness controls tailoring; new browser profiles receive no applicant data.</w:t>
       </w:r>
     </w:p>
     <w:p>
@@ -3335,7 +3406,7 @@
     </w:p>
     <w:p>
       <w:r>
-        <w:t>Clear saved versions removes the history key, with an empty-array fallback if removal fails. It clears memory, the current application, editors, and prepared export links, cancels in-flight work, and announces the outcome. A total storage failure exposes a retry instead of claiming confirmed deletion. A storage event clears stale copies in other app tabs. Clear master resume stores the explicit blank and resets the workspace but keeps history.</w:t>
+        <w:t>Clear saved versions deletes the history key when unprotected, or awaits an encrypted empty-history write when protected. It clears memory, output, editors and prepared links, cancels pending work and reports persistence failures. Clear master stores a blank source and keeps history. Other-tab storage changes invalidate stale copies.</w:t>
       </w:r>
     </w:p>
     <w:p>
@@ -3353,13 +3424,79 @@
     </w:p>
     <w:p>
       <w:r>
-        <w:t>Applicant data is browser-local and is not encrypted at rest by the app. Site access is controlled by the hosting audience; there is no per-applicant login. Users of one browser profile can access that profile’s stored data. A normal app link transfers neither master nor history. The standalone export link intentionally carries its selected document in a fragment, not the HTTP request. Treat copied links and shared devices accordingly.</w:t>
+        <w:t>Applicant data stays local. Opt-in password protection encrypts saved records and removes legacy plaintext. Without it, users sharing a browser profile can read saved data. Normal app and download URLs contain no applicant content. Site sharing exposes app code; no applicant database or cloud account exists.</w:t>
       </w:r>
     </w:p>
     <w:p>
       <w:r>
-        <w:t>Escape user and stored strings before inserting HTML. Validate decoded transfers and stored shapes, avoid executable interpolation, and do not publish test fixtures or personal resume data. The browser loads only vendored export assets. No service worker or native offline package is currently shipped, so offline availability is not promised.</w:t>
+        <w:t>Escape stored text, validate transfers and avoid executable interpolation. Both HTML pages use no-referrer metadata and same-origin script/connection policies, block object embeds and external form submission, and load local vendors. No service worker or native offline package is shipped.</w:t>
       </w:r>
+    </w:p>
+    <w:p>
+      <w:pPr>
+        <w:pStyle w:val="Heading1"/>
+        <w:pageBreakBefore/>
+      </w:pPr>
+      <w:r>
+        <w:t>Password protected storage API</w:t>
+      </w:r>
+    </w:p>
+    <w:p>
+      <w:pPr>
+        <w:pStyle w:val="Code"/>
+      </w:pPr>
+      <w:r>
+        <w:t>PrivateVault(storage, crypto)</w:t>
+        <w:br/>
+        <w:t xml:space="preserve">  exists() -&gt; boolean</w:t>
+        <w:br/>
+        <w:t xml:space="preserve">  create(passphrase, {master, history}) -&gt; Promise&lt;void&gt;</w:t>
+        <w:br/>
+        <w:t xml:space="preserve">  unlock(passphrase) -&gt; Promise&lt;{master, history}&gt;</w:t>
+        <w:br/>
+        <w:t xml:space="preserve">  write({master, history}) -&gt; Promise&lt;void&gt;</w:t>
+        <w:br/>
+        <w:t xml:space="preserve">  flush() -&gt; Promise&lt;void&gt;</w:t>
+        <w:br/>
+        <w:t xml:space="preserve">  lock() -&gt; void</w:t>
+      </w:r>
+    </w:p>
+    <w:p>
+      <w:r>
+        <w:t>privacy.js uses Web Crypto AES-GCM with a 256-bit nonextractable key, a random 16-byte salt and a fresh 12-byte IV for each write. PBKDF2-HMAC-SHA-256 derives the key with 600,000 iterations. The minimum passphrase length is 12 characters. localStorage key le-resume-studio-private-vault-v1 contains schema, salt, IV, work factor and authenticated ciphertext; it contains no plaintext master, history, password or key. Authentication failure rejects wrong passwords and modified ciphertext.</w:t>
+      </w:r>
+    </w:p>
+    <w:p>
+      <w:r>
+        <w:t>Writes serialize through a promise queue and capture a JSON snapshot. Lock increments an epoch and drops the key; a pending encryption cannot write after locking. Encrypted writes replace the vault atomically only after encryption succeeds. Save master and deletion controls await persistence. Other-tab vault updates invalidate an unlocked copy. Storage failure preserves the current tab and exposes an error rather than claiming durable protection. Protection setup and unlock both retry deletion of legacy plaintext keys.</w:t>
+      </w:r>
+    </w:p>
+    <w:p>
+      <w:r>
+        <w:t>This is local passphrase protection, not a server login or a password recovery system. It does not hide an unlocked tab, protect downloads on the filesystem, secure a compromised device, or prevent a trusted future app script from reading an unlocked workspace. Browser session restoration and actual popup/iframe behavior require real-device verification. Close download tabs when handing over a shared device. Keep the app origin and vendored assets trusted.</w:t>
+      </w:r>
+    </w:p>
+    <w:p>
+      <w:hyperlink r:id="rId11">
+        <w:r>
+          <w:rPr>
+            <w:color w:val="000000"/>
+            <w:u w:val="single"/>
+          </w:rPr>
+          <w:t>OWASP password storage guidance</w:t>
+        </w:r>
+      </w:hyperlink>
+    </w:p>
+    <w:p>
+      <w:hyperlink r:id="rId12">
+        <w:r>
+          <w:rPr>
+            <w:color w:val="000000"/>
+            <w:u w:val="single"/>
+          </w:rPr>
+          <w:t>MDN sessionStorage and opener inheritance</w:t>
+        </w:r>
+      </w:hyperlink>
     </w:p>
     <w:p>
       <w:pPr>
@@ -3380,7 +3517,7 @@
     </w:p>
     <w:p>
       <w:r>
-        <w:t>The master-upload release passed 107 node:test checks on October 12 2026. Tests cover tailoring evidence, both document scores, English rules, actual export bytes, transfers, save failures, history deletion, reset guards, keyboard semantics, capability fallbacks, and seven fresh-master journeys. DOM adapters and capability simulations do not substitute for browser rendering or real ATS uploads.</w:t>
+        <w:t>The formatting and privacy release passed 119 node:test checks on October 12 2026. Tests cover tailoring evidence, both document scores, English rules, actual export bytes, transfers, save failures, history deletion, reset guards, keyboard semantics, capability fallbacks, and seven fresh-master journeys. DOM adapters and capability simulations do not substitute for browser rendering or real ATS uploads.</w:t>
       </w:r>
     </w:p>
     <w:p>
@@ -3496,7 +3633,7 @@
       <w:pPr>
         <w:spacing w:after="60"/>
       </w:pPr>
-      <w:hyperlink r:id="rId11">
+      <w:hyperlink r:id="rId13">
         <w:r>
           <w:rPr>
             <w:color w:val="000000"/>
@@ -3510,7 +3647,7 @@
       <w:pPr>
         <w:spacing w:after="60"/>
       </w:pPr>
-      <w:hyperlink r:id="rId12">
+      <w:hyperlink r:id="rId14">
         <w:r>
           <w:rPr>
             <w:color w:val="000000"/>
@@ -3524,7 +3661,7 @@
       <w:pPr>
         <w:spacing w:after="60"/>
       </w:pPr>
-      <w:hyperlink r:id="rId13">
+      <w:hyperlink r:id="rId15">
         <w:r>
           <w:rPr>
             <w:color w:val="000000"/>
@@ -3538,7 +3675,7 @@
       <w:pPr>
         <w:spacing w:after="60"/>
       </w:pPr>
-      <w:hyperlink r:id="rId14">
+      <w:hyperlink r:id="rId16">
         <w:r>
           <w:rPr>
             <w:color w:val="000000"/>
@@ -3552,7 +3689,7 @@
       <w:pPr>
         <w:spacing w:after="60"/>
       </w:pPr>
-      <w:hyperlink r:id="rId15">
+      <w:hyperlink r:id="rId17">
         <w:r>
           <w:rPr>
             <w:color w:val="000000"/>
@@ -3566,7 +3703,7 @@
       <w:pPr>
         <w:spacing w:after="60"/>
       </w:pPr>
-      <w:hyperlink r:id="rId16">
+      <w:hyperlink r:id="rId18">
         <w:r>
           <w:rPr>
             <w:color w:val="000000"/>
@@ -3580,7 +3717,7 @@
       <w:pPr>
         <w:spacing w:after="60"/>
       </w:pPr>
-      <w:hyperlink r:id="rId17">
+      <w:hyperlink r:id="rId19">
         <w:r>
           <w:rPr>
             <w:color w:val="000000"/>

</xml_diff>

<commit_message>
Make master resume upload-only and clear prior source data; document source formatting
</commit_message>
<xml_diff>
--- a/docs/Le_Resume_Studio_Developer_Guide.docx
+++ b/docs/Le_Resume_Studio_Developer_Guide.docx
@@ -20,7 +20,7 @@
     </w:p>
     <w:p>
       <w:r>
-        <w:t>October 12 2026  |  Published app version 15</w:t>
+        <w:t>October 12 2026  |  Published app version 16</w:t>
       </w:r>
     </w:p>
     <w:p>
@@ -788,7 +788,7 @@
                 <w:color w:val="000000"/>
                 <w:sz w:val="21"/>
               </w:rPr>
-              <w:t>DOM orchestration, master editor, saved history, document edits, reset lifecycle, clipboard, and export dialogs.</w:t>
+              <w:t>DOM orchestration, upload-only master, saved history, document edits, reset lifecycle, clipboard, and export dialogs.</w:t>
             </w:r>
           </w:p>
         </w:tc>
@@ -857,7 +857,7 @@
                 <w:color w:val="000000"/>
                 <w:sz w:val="21"/>
               </w:rPr>
-              <w:t>createBlankMaster and roleHeaderFields. Uploaded header order is retained; manual entry defaults to role/company/years.</w:t>
+              <w:t>createBlankMaster and roleHeaderFields. Uploaded header order is retained; source headings retain role/company/years.</w:t>
             </w:r>
           </w:p>
         </w:tc>
@@ -995,7 +995,7 @@
                 <w:color w:val="000000"/>
                 <w:sz w:val="21"/>
               </w:rPr>
-              <w:t>Local file validation, DOCX/PDF/TXT text extraction, conservative draft parsing and cancellation.</w:t>
+              <w:t>imports.js reads DOCX/PDF/TXT/RTF and validates facts; formatting.js detects bounded typography and section order.</w:t>
             </w:r>
           </w:p>
         </w:tc>
@@ -1789,7 +1789,7 @@
     </w:p>
     <w:p>
       <w:r>
-        <w:t>Master and resume objects are plain serializable data. A new factory returns empty strings and arrays, with source set to Blank master resume. The editor starts with one empty role and saves only after validating the required facts. Upload imports add source, importedText and importedFileName. The extracted text persists locally with the saved master and snapshots; Clear master removes it from the master, while saved versions remain until separately deleted.</w:t>
+        <w:t>Master and resume objects are plain serializable data. The blank factory returns empty strings and arrays. A readable upload saves only after required source facts validate. Imports add source, importedText, importedFileName and formatting metadata. Clear Master Resume writes an explicit blank marker, clears source text and current output, and prevents history recovery from restoring the deleted master. Saved versions retain separate snapshots until cleared.</w:t>
       </w:r>
     </w:p>
     <w:p>
@@ -1803,7 +1803,7 @@
         <w:br/>
         <w:t xml:space="preserve">  email: "avery@example.com", linkedin: "",</w:t>
         <w:br/>
-        <w:t xml:space="preserve">  source: "Edited master resume",</w:t>
+        <w:t xml:space="preserve">  source: "Uploaded master resume",</w:t>
         <w:br/>
         <w:t xml:space="preserve">  summary: "Business analyst supporting reporting.",</w:t>
         <w:br/>
@@ -1830,7 +1830,7 @@
     </w:p>
     <w:p>
       <w:r>
-        <w:t>The example is fictitious. The editor requires name, summary, a competency, and complete employer/title/dates/bullets for every role. Added education entries require all three fields. Contact details and skill groups are optional; empty skill groups are omitted. UI limits are 30 roles and 20 skill groups or education entries. These UI limits are not a substitute for validating stored or transferred data.</w:t>
+        <w:t>The example is fictitious. A source upload requires name, summary, a competency and complete employer/title/dates/bullets for every role. Recognized education entries require all three fields. Contact details and skill groups are optional; empty skill groups are omitted. UI limits are 30 roles and 20 skill groups or education entries. These UI limits are not a substitute for validating stored or transferred data.</w:t>
       </w:r>
     </w:p>
     <w:tbl>
@@ -2219,32 +2219,48 @@
       <w:r>
         <w:t>validateResumeFile(file) -&gt; extension or throws</w:t>
         <w:br/>
-        <w:t>extractResumeText(file, {signal, loadZip, loadPDF} = {})</w:t>
+        <w:t>extractResumeText(file, {signal, loadZip, loadPDF, onFormatting} = {})</w:t>
         <w:br/>
         <w:t xml:space="preserve">  -&gt; Promise&lt;string&gt;</w:t>
         <w:br/>
-        <w:t>parseResumeText(text) -&gt; editable master draft</w:t>
+        <w:t>parseResumeText(text) -&gt; parsed source object</w:t>
       </w:r>
     </w:p>
     <w:p>
       <w:r>
-        <w:t>File validation accepts .pdf, .docx and .txt, with a 10 MB limit. UTF-8 TXT decoding rejects invalid encoding; DOCX uses JSZip and word/document.xml text with a 30 MB expanded archive limit. PDF.js extracts text from up to 30 pages, with evaluation disabled, local worker and standard fonts. No OCR is provided. Extracted text is capped at 200,000 characters; image-only or password-protected PDFs produce actionable errors.</w:t>
+        <w:t>File validation accepts PDF, DOCX, TXT and RTF with a 10 MB limit. TXT is strict UTF-8. RTF decodes Windows-1252 and supported Unicode controls, excludes metadata and embedded objects, and never executes content. DOCX uses JSZip with a 30 MB expanded archive limit. PDF.js reads up to 30 pages with evaluation disabled and local assets. No OCR is provided. Text is capped at 200,000 characters.</w:t>
       </w:r>
     </w:p>
     <w:p>
       <w:r>
-        <w:t>Parsing recognizes common section headings and confirmed three-field employment headings. DOCX numbering retains bullet markers; PDF text is ordered by row and horizontal position. Until a complete next heading is found, text stays with the current role, including its final accomplishment. Roles retain headerOrder for preview, TXT, Word and PDF; manual entries default to title, employer, dates. It copies extracted facts into editable fields, leaves missing values blank and retains importedText for comparison. It does not infer qualifications or guarantee recognition of every layout. Review and explicit Save are required. A successful read replaces the unsaved draft; errors leave the existing draft and saved master intact.</w:t>
+        <w:t>Parsing recognizes common sections and confirmed three-field employment headings. Word numbering preserves bullet markers; PDF text is ordered by row and horizontal position. Until a complete next heading is confirmed, text remains with the current role, including its final accomplishment. headerOrder preserves role, employer and date order. A complete upload saves automatically; missing required facts produce an error without replacing the prior saved source.</w:t>
       </w:r>
     </w:p>
     <w:p>
       <w:r>
-        <w:t>app.js guards asynchronous reads with an epoch and AbortController. Clear, dialog close, cancellation and workspace reset invalidate pending imports; a late completion cannot restore deleted content. Save is disabled during import. The native labeled file input, polite progress, associated alert errors and review textarea preserve keyboard access. Tests exercise actual generated Word/PDF extraction and upload/save/clear behavior using fictional identifiers.</w:t>
+        <w:t>app.js guards reads with an epoch and AbortController. Clear, dialog close and workspace reset invalidate pending reads; late completion cannot restore deleted content. Upload disables the picker while reading; Clear remains available to cancel a pending read. Progress, associated errors and a read-only text view support keyboard access. Clear resets the file selection, extracted text, master marker and current output; stored versions remain separate.</w:t>
       </w:r>
     </w:p>
     <w:p>
       <w:r>
-        <w:t>PDF.js and its worker must be served as JavaScript modules from dist/vendor/pdfjs; preserve standard_fonts and licenses. JSZip is loaded only for DOCX and PDF.js only for PDF. A failed reader load leaves manual entry and TXT available. Browser reading performs no resume-content network upload.</w:t>
+        <w:t>PDF.js and its worker must be served as modules with standard_fonts and licenses. Readers load only when needed. If DOCX or PDF reading fails, revise the file or upload TXT or RTF; manual master entry is unavailable. formatting.js normalizes bounded typography, margins, page size, labels and section order. Word uses detected font settings; PDF infers a compatible serif, sans or mono family. Tables, graphics and arbitrary original positions are not reproduced.</w:t>
       </w:r>
+    </w:p>
+    <w:p>
+      <w:r>
+        <w:t>TXT and RTF use a single column, Arial 11 point and 0.75 inch margins, within MIT recommended font and margin ranges. This fallback does not guarantee ATS acceptance.</w:t>
+      </w:r>
+    </w:p>
+    <w:p>
+      <w:hyperlink r:id="rId11">
+        <w:r>
+          <w:rPr>
+            <w:color w:val="000000"/>
+            <w:u w:val="single"/>
+          </w:rPr>
+          <w:t>MIT Resume Checklist</w:t>
+        </w:r>
+      </w:hyperlink>
     </w:p>
     <w:p>
       <w:pPr>
@@ -2402,7 +2418,7 @@
     </w:p>
     <w:p>
       <w:r>
-        <w:t>createExportBlob wraps PDF bytes in the proper Blob type and loads only the requested vendored library. Tests can inject docx, pdf, and fonts. TXT uses no export library. loadExportLibrary deduplicates concurrent script loads and permits retry after failure. PDFs embed Nimbus Sans; non-ASCII normalization can alter characters, so the file review warns users to choose Word or TXT when needed.</w:t>
+        <w:t>createExportBlob wraps PDF bytes in the proper Blob type and loads the requested local library. TXT uses no export library. Source formatting travels with resume payloads and snapshots; cover letters keep their professional template. PDFs embed matching CFF font programs: Nimbus Sans or PDF.js serif/mono assets. Non-ASCII normalization may alter characters, so the review recommends Word or TXT when needed.</w:t>
       </w:r>
     </w:p>
     <w:tbl>
@@ -2958,12 +2974,12 @@
         <w:pStyle w:val="Heading2"/>
       </w:pPr>
       <w:r>
-        <w:t>Dynamic master editing</w:t>
+        <w:t>Upload and clear controls</w:t>
       </w:r>
     </w:p>
     <w:p>
       <w:r>
-        <w:t>buildEditor renders the master draft, using labels and per-role context IDs. The master-editor click handler delegates Add/Remove actions via data-master-action. Before modifying an array, collectEditor captures unsaved form values without validation, then renders the draft again and focuses the new field or Add control. Save performs validation; removing the only role is disabled. Keep DOM IDs and data indexes aligned after any splice.</w:t>
+        <w:t>The master dialog contains a labeled native file picker, read-only extracted text and Clear Master Resume. There is no master form, manual Save or Add/Remove handler. buildEditor and collectEditor are used only for tailored output. Source corrections happen in the original file and are uploaded again. Clear invalidates pending reads before awaiting storage and resetWorkspace empties previews, extracted text, picker and prepared links.</w:t>
       </w:r>
     </w:p>
     <w:p>
@@ -3406,7 +3422,7 @@
     </w:p>
     <w:p>
       <w:r>
-        <w:t>Clear saved versions deletes the history key when unprotected, or awaits an encrypted empty-history write when protected. It clears memory, output, editors and prepared links, cancels pending work and reports persistence failures. Clear master stores a blank source and keeps history. Other-tab storage changes invalidate stale copies.</w:t>
+        <w:t>Clear saved versions deletes the history key when unprotected, or awaits an encrypted empty-history write when protected. It clears memory, output, editors and prepared links, cancels pending work and reports persistence failures. Clear Master Resume stores a blank source and keeps history. Other-tab storage changes invalidate stale copies.</w:t>
       </w:r>
     </w:p>
     <w:p>
@@ -3468,7 +3484,7 @@
     </w:p>
     <w:p>
       <w:r>
-        <w:t>Writes serialize through a promise queue and capture a JSON snapshot. Lock increments an epoch and drops the key; a pending encryption cannot write after locking. Encrypted writes replace the vault atomically only after encryption succeeds. Save master and deletion controls await persistence. Other-tab vault updates invalidate an unlocked copy. Storage failure preserves the current tab and exposes an error rather than claiming durable protection. Protection setup and unlock both retry deletion of legacy plaintext keys.</w:t>
+        <w:t>Writes serialize through a promise queue and capture a JSON snapshot. Lock increments an epoch and drops the key; a pending encryption cannot write after locking. Encrypted writes replace the vault atomically only after encryption succeeds. Upload and deletion controls await persistence. Other-tab vault updates invalidate an unlocked copy. Storage failure preserves the current tab and exposes an error rather than claiming durable protection. Protection setup and unlock both retry deletion of legacy plaintext keys.</w:t>
       </w:r>
     </w:p>
     <w:p>
@@ -3477,7 +3493,7 @@
       </w:r>
     </w:p>
     <w:p>
-      <w:hyperlink r:id="rId11">
+      <w:hyperlink r:id="rId12">
         <w:r>
           <w:rPr>
             <w:color w:val="000000"/>
@@ -3488,7 +3504,7 @@
       </w:hyperlink>
     </w:p>
     <w:p>
-      <w:hyperlink r:id="rId12">
+      <w:hyperlink r:id="rId13">
         <w:r>
           <w:rPr>
             <w:color w:val="000000"/>
@@ -3517,7 +3533,7 @@
     </w:p>
     <w:p>
       <w:r>
-        <w:t>The formatting and privacy release passed 119 node:test checks on October 12 2026. Tests cover tailoring evidence, both document scores, English rules, actual export bytes, transfers, save failures, history deletion, reset guards, keyboard semantics, capability fallbacks, and seven fresh-master journeys. DOM adapters and capability simulations do not substitute for browser rendering or real ATS uploads.</w:t>
+        <w:t>The upload and source formatting release passed 124 node:test checks on October 12 2026. Tests cover tailoring evidence, both document scores, English rules, actual export bytes, transfers, save failures, history deletion, reset guards, keyboard semantics, capability fallbacks, and seven fresh-master journeys. DOM adapters and capability simulations do not substitute for browser rendering or real ATS uploads.</w:t>
       </w:r>
     </w:p>
     <w:p>
@@ -3633,7 +3649,7 @@
       <w:pPr>
         <w:spacing w:after="60"/>
       </w:pPr>
-      <w:hyperlink r:id="rId13">
+      <w:hyperlink r:id="rId14">
         <w:r>
           <w:rPr>
             <w:color w:val="000000"/>
@@ -3647,7 +3663,7 @@
       <w:pPr>
         <w:spacing w:after="60"/>
       </w:pPr>
-      <w:hyperlink r:id="rId14">
+      <w:hyperlink r:id="rId15">
         <w:r>
           <w:rPr>
             <w:color w:val="000000"/>
@@ -3661,7 +3677,7 @@
       <w:pPr>
         <w:spacing w:after="60"/>
       </w:pPr>
-      <w:hyperlink r:id="rId15">
+      <w:hyperlink r:id="rId16">
         <w:r>
           <w:rPr>
             <w:color w:val="000000"/>
@@ -3675,7 +3691,7 @@
       <w:pPr>
         <w:spacing w:after="60"/>
       </w:pPr>
-      <w:hyperlink r:id="rId16">
+      <w:hyperlink r:id="rId17">
         <w:r>
           <w:rPr>
             <w:color w:val="000000"/>
@@ -3689,7 +3705,7 @@
       <w:pPr>
         <w:spacing w:after="60"/>
       </w:pPr>
-      <w:hyperlink r:id="rId17">
+      <w:hyperlink r:id="rId18">
         <w:r>
           <w:rPr>
             <w:color w:val="000000"/>
@@ -3703,7 +3719,7 @@
       <w:pPr>
         <w:spacing w:after="60"/>
       </w:pPr>
-      <w:hyperlink r:id="rId18">
+      <w:hyperlink r:id="rId19">
         <w:r>
           <w:rPr>
             <w:color w:val="000000"/>
@@ -3717,7 +3733,7 @@
       <w:pPr>
         <w:spacing w:after="60"/>
       </w:pPr>
-      <w:hyperlink r:id="rId19">
+      <w:hyperlink r:id="rId20">
         <w:r>
           <w:rPr>
             <w:color w:val="000000"/>

</xml_diff>

<commit_message>
Synchronize published Le Resume Studio version 17 and repeat-upload guides
</commit_message>
<xml_diff>
--- a/docs/Le_Resume_Studio_Developer_Guide.docx
+++ b/docs/Le_Resume_Studio_Developer_Guide.docx
@@ -20,7 +20,7 @@
     </w:p>
     <w:p>
       <w:r>
-        <w:t>October 12 2026  |  Published app version 16</w:t>
+        <w:t>October 12 2026  |  Published app version 17</w:t>
       </w:r>
     </w:p>
     <w:p>
@@ -2238,7 +2238,7 @@
     </w:p>
     <w:p>
       <w:r>
-        <w:t>app.js guards reads with an epoch and AbortController. Clear, dialog close and workspace reset invalidate pending reads; late completion cannot restore deleted content. Upload disables the picker while reading; Clear remains available to cancel a pending read. Progress, associated errors and a read-only text view support keyboard access. Clear resets the file selection, extracted text, master marker and current output; stored versions remain separate.</w:t>
+        <w:t>app.js guards reads with an epoch and AbortController. Clear, dialog close and workspace reset invalidate pending reads; late completion cannot restore deleted content. Upload disables the picker while reading; Clear can cancel a pending read. The input clears before its chooser opens and after completion, allowing repeated selection of the same file. Filename and applicant name are never duplicate blockers. Progress, associated errors and a read-only text view support keyboard access. Clear resets the file selection, extracted text, master marker and current output; stored versions remain separate.</w:t>
       </w:r>
     </w:p>
     <w:p>
@@ -3533,7 +3533,7 @@
     </w:p>
     <w:p>
       <w:r>
-        <w:t>The upload and source formatting release passed 124 node:test checks on October 12 2026. Tests cover tailoring evidence, both document scores, English rules, actual export bytes, transfers, save failures, history deletion, reset guards, keyboard semantics, capability fallbacks, and seven fresh-master journeys. DOM adapters and capability simulations do not substitute for browser rendering or real ATS uploads.</w:t>
+        <w:t>The upload and source formatting release passed 126 node:test checks on October 12 2026. Tests cover tailoring evidence, both document scores, English rules, actual export bytes, transfers, save failures, history deletion, reset guards, keyboard semantics, capability fallbacks, and seven fresh-master journeys. DOM adapters and capability simulations do not substitute for browser rendering or real ATS uploads.</w:t>
       </w:r>
     </w:p>
     <w:p>

</xml_diff>

<commit_message>
Require unique master resume filenames and update version 18 guides
</commit_message>
<xml_diff>
--- a/docs/Le_Resume_Studio_Developer_Guide.docx
+++ b/docs/Le_Resume_Studio_Developer_Guide.docx
@@ -20,7 +20,7 @@
     </w:p>
     <w:p>
       <w:r>
-        <w:t>October 12 2026  |  Published app version 17</w:t>
+        <w:t>October 14 2026  |  Published app version 18</w:t>
       </w:r>
     </w:p>
     <w:p>
@@ -2238,7 +2238,7 @@
     </w:p>
     <w:p>
       <w:r>
-        <w:t>app.js guards reads with an epoch and AbortController. Clear, dialog close and workspace reset invalidate pending reads; late completion cannot restore deleted content. Upload disables the picker while reading; Clear can cancel a pending read. The input clears before its chooser opens and after completion, allowing repeated selection of the same file. Filename and applicant name are never duplicate blockers. Progress, associated errors and a read-only text view support keyboard access. Clear resets the file selection, extracted text, master marker and current output; stored versions remain separate.</w:t>
+        <w:t>app.js guards reads with an epoch and AbortController. Clear, dialog close and workspace reset invalidate pending reads; late completion cannot restore deleted content. Upload disables the picker while reading; Clear can cancel a pending read. The input clears before its chooser opens and after completion, allowing a rejected selection to be retried after renaming. Before extraction, filenames are normalized with NFKC, trimmed and compared without case against the current master filename and its uploadedFileNames array. Only successful imports reserve a name; the array is saved alongside the master through the existing browser storage or encrypted vault. Clear Master Resume discards this history. Names are never checked across users. Applicant names are not duplicate blockers. Progress, associated errors and a read-only text view support keyboard access. Clear resets the file selection, extracted text, master marker and current output; stored versions remain separate.</w:t>
       </w:r>
     </w:p>
     <w:p>
@@ -3533,7 +3533,7 @@
     </w:p>
     <w:p>
       <w:r>
-        <w:t>The upload and source formatting release passed 126 node:test checks on October 12 2026. Tests cover tailoring evidence, both document scores, English rules, actual export bytes, transfers, save failures, history deletion, reset guards, keyboard semantics, capability fallbacks, and seven fresh-master journeys. DOM adapters and capability simulations do not substitute for browser rendering or real ATS uploads.</w:t>
+        <w:t>The upload and source formatting release passed 127 node:test checks on October 14 2026. Tests cover tailoring evidence, both document scores, English rules, actual export bytes, transfers, save failures, history deletion, reset guards, keyboard semantics, capability fallbacks, and seven fresh-master journeys. DOM adapters and capability simulations do not substitute for browser rendering or real ATS uploads.</w:t>
       </w:r>
     </w:p>
     <w:p>

</xml_diff>

<commit_message>
Accept master resume uploads without required sections or applicant fields; update version 19 guides
</commit_message>
<xml_diff>
--- a/docs/Le_Resume_Studio_Developer_Guide.docx
+++ b/docs/Le_Resume_Studio_Developer_Guide.docx
@@ -20,7 +20,7 @@
     </w:p>
     <w:p>
       <w:r>
-        <w:t>October 14 2026  |  Published app version 18</w:t>
+        <w:t>October 14 2026  |  Published app version 19</w:t>
       </w:r>
     </w:p>
     <w:p>
@@ -1789,7 +1789,7 @@
     </w:p>
     <w:p>
       <w:r>
-        <w:t>Master and resume objects are plain serializable data. The blank factory returns empty strings and arrays. A readable upload saves only after required source facts validate. Imports add source, importedText, importedFileName and formatting metadata. Clear Master Resume writes an explicit blank marker, clears source text and current output, and prevents history recovery from restoring the deleted master. Saved versions retain separate snapshots until cleared.</w:t>
+        <w:t>Master and resume objects are plain serializable data. The blank factory returns empty strings and arrays. A readable upload saves without required applicant fields or section headings. Imports add source, importedText, importedFileName and formatting metadata. Clear Master Resume writes an explicit blank marker, clears source text and current output, and prevents history recovery from restoring the deleted master. Saved versions retain separate snapshots until cleared.</w:t>
       </w:r>
     </w:p>
     <w:p>
@@ -1830,7 +1830,7 @@
     </w:p>
     <w:p>
       <w:r>
-        <w:t>The example is fictitious. A source upload requires name, summary, a competency and complete employer/title/dates/bullets for every role. Recognized education entries require all three fields. Contact details and skill groups are optional; empty skill groups are omitted. UI limits are 30 roles and 20 skill groups or education entries. These UI limits are not a substitute for validating stored or transferred data.</w:t>
+        <w:t>The example is fictitious. All applicant fields are optional for upload. Shape validation permits empty strings and arrays. Unlabeled text is retained as source summary content when no structure is recognized; missing facts are not invented. Imported text makes a saved upload ready even when the name is absent. Export payloads allow a blank name. File-format, size and readable-text protections still apply.</w:t>
       </w:r>
     </w:p>
     <w:tbl>
@@ -2233,7 +2233,7 @@
     </w:p>
     <w:p>
       <w:r>
-        <w:t>Parsing recognizes common sections and confirmed three-field employment headings. Word numbering preserves bullet markers; PDF text is ordered by row and horizontal position. Until a complete next heading is confirmed, text remains with the current role, including its final accomplishment. headerOrder preserves role, employer and date order. A complete upload saves automatically; missing required facts produce an error without replacing the prior saved source.</w:t>
+        <w:t>Parsing recognizes common sections and confirmed three-field employment headings. Word numbering preserves bullet markers; PDF text is ordered by row and horizontal position. Until a complete next heading is confirmed, text remains with the current role, including its final accomplishment. headerOrder preserves role, employer and date order. Readable uploads save automatically even with missing facts or headings. Unreadable or invalid files preserve the prior source. Roles without bullets do not produce accomplishment paragraphs in the cover letter.</w:t>
       </w:r>
     </w:p>
     <w:p>
@@ -2295,7 +2295,7 @@
     </w:p>
     <w:p>
       <w:r>
-        <w:t>Synchronous entry point. Rejects fewer than 80 trimmed characters or 12 words, more than 40,000 characters, or a master lacking a name or role. balanced retains up to four first-role bullets and three later-role bullets; detailed keeps all. It clones the master, creates both documents, and returns reviews. Catch its Error and show a readable message without enabling exports.</w:t>
+        <w:t>Synchronous entry point. Rejects fewer than 80 trimmed characters or 12 words, more than 40,000 characters, or an entirely empty master. balanced retains up to four first-role bullets and three later-role bullets; detailed keeps all. It clones the master, creates both documents, and returns reviews. Catch its Error and show a readable message without enabling exports.</w:t>
       </w:r>
     </w:p>
     <w:p>
@@ -3533,7 +3533,7 @@
     </w:p>
     <w:p>
       <w:r>
-        <w:t>The upload and source formatting release passed 127 node:test checks on October 14 2026. Tests cover tailoring evidence, both document scores, English rules, actual export bytes, transfers, save failures, history deletion, reset guards, keyboard semantics, capability fallbacks, and seven fresh-master journeys. DOM adapters and capability simulations do not substitute for browser rendering or real ATS uploads.</w:t>
+        <w:t>The upload and source formatting release passed 128 node:test checks on October 14 2026. Tests cover tailoring evidence, both document scores, English rules, actual export bytes, transfers, save failures, history deletion, reset guards, keyboard semantics, capability fallbacks, and seven fresh-master journeys. DOM adapters and capability simulations do not substitute for browser rendering or real ATS uploads.</w:t>
       </w:r>
     </w:p>
     <w:p>

</xml_diff>

<commit_message>
Restore master resume section layout and reliable clearing (version 20)
</commit_message>
<xml_diff>
--- a/docs/Le_Resume_Studio_Developer_Guide.docx
+++ b/docs/Le_Resume_Studio_Developer_Guide.docx
@@ -20,7 +20,7 @@
     </w:p>
     <w:p>
       <w:r>
-        <w:t>October 14 2026  |  Published app version 19</w:t>
+        <w:t>October 14 2026  |  Published app version 20</w:t>
       </w:r>
     </w:p>
     <w:p>
@@ -2238,7 +2238,7 @@
     </w:p>
     <w:p>
       <w:r>
-        <w:t>app.js guards reads with an epoch and AbortController. Clear, dialog close and workspace reset invalidate pending reads; late completion cannot restore deleted content. Upload disables the picker while reading; Clear can cancel a pending read. The input clears before its chooser opens and after completion, allowing a rejected selection to be retried after renaming. Before extraction, filenames are normalized with NFKC, trimmed and compared without case against the current master filename and its uploadedFileNames array. Only successful imports reserve a name; the array is saved alongside the master through the existing browser storage or encrypted vault. Clear Master Resume discards this history. Names are never checked across users. Applicant names are not duplicate blockers. Progress, associated errors and a read-only text view support keyboard access. Clear resets the file selection, extracted text, master marker and current output; stored versions remain separate.</w:t>
+        <w:t>app.js guards reads with an epoch and AbortController. Clear, dialog close and workspace reset invalidate pending reads; late completion cannot restore deleted content. Upload disables the picker while reading; Clear can cancel a pending read. The input clears before its chooser opens and after completion, allowing a rejected selection to be retried after renaming. Before extraction, filenames are normalized with NFKC, trimmed and compared without case against the current master filename and its uploadedFileNames array. Only successful imports reserve a name; the array is saved alongside the master through the existing browser storage or encrypted vault. Clear Master Resume discards this history. Names are never checked across users. Applicant names are not duplicate blockers. Progress, associated errors and a read-only text view support keyboard access. Clear resets the file selection, extracted text, master marker and current output; stored versions remain separate. It calls resetWorkspace immediately after blanking the master and before awaiting storeValue, so text boxes clear even while encrypted storage is still writing.</w:t>
       </w:r>
     </w:p>
     <w:p>
@@ -2979,7 +2979,7 @@
     </w:p>
     <w:p>
       <w:r>
-        <w:t>The master dialog contains a labeled native file picker, read-only extracted text and Clear Master Resume. There is no master form, manual Save or Add/Remove handler. buildEditor and collectEditor are used only for tailored output. Source corrections happen in the original file and are uploaded again. Clear invalidates pending reads before awaiting storage and resetWorkspace empties previews, extracted text, picker and prepared links.</w:t>
+        <w:t>The master dialog restores version 1 section grouping with read-only contact, summary, competencies, expandable experience, technical skills and education. showImportedText renders escaped facts and bullets, plus the original-text disclosure. The native picker remains the only source input. There is no master form, manual Save or Add/Remove handler. buildEditor and collectEditor are used only for tailored output. Source corrections happen in the original file and are uploaded again. Clear cancels pending reads and resets all displayed data before awaiting storage. keepMasterOpen leaves the empty dialog visible. A blank marker replaces saved master facts and filename history; encrypted storage writes the blank snapshot. masterDeletionFailed enables retry after a failed write. Storage events invalidate a cleared master in other tabs.</w:t>
       </w:r>
     </w:p>
     <w:p>
@@ -3533,7 +3533,7 @@
     </w:p>
     <w:p>
       <w:r>
-        <w:t>The upload and source formatting release passed 128 node:test checks on October 14 2026. Tests cover tailoring evidence, both document scores, English rules, actual export bytes, transfers, save failures, history deletion, reset guards, keyboard semantics, capability fallbacks, and seven fresh-master journeys. DOM adapters and capability simulations do not substitute for browser rendering or real ATS uploads.</w:t>
+        <w:t>The master review and deletion release passed 132 node:test checks on October 14 2026. Tests cover tailoring evidence, both document scores, English rules, actual export bytes, transfers, save failures, history deletion, reset guards, keyboard semantics, capability fallbacks, and seven fresh-master journeys. DOM adapters and capability simulations do not substitute for browser rendering or real ATS uploads.</w:t>
       </w:r>
     </w:p>
     <w:p>

</xml_diff>

<commit_message>
Delete all master upload data and separate each Experience role (version 21)
</commit_message>
<xml_diff>
--- a/docs/Le_Resume_Studio_Developer_Guide.docx
+++ b/docs/Le_Resume_Studio_Developer_Guide.docx
@@ -20,7 +20,7 @@
     </w:p>
     <w:p>
       <w:r>
-        <w:t>October 14 2026  |  Published app version 20</w:t>
+        <w:t>October 14 2026  |  Published app version 21</w:t>
       </w:r>
     </w:p>
     <w:p>
@@ -1789,7 +1789,7 @@
     </w:p>
     <w:p>
       <w:r>
-        <w:t>Master and resume objects are plain serializable data. The blank factory returns empty strings and arrays. A readable upload saves without required applicant fields or section headings. Imports add source, importedText, importedFileName and formatting metadata. Clear Master Resume writes an explicit blank marker, clears source text and current output, and prevents history recovery from restoring the deleted master. Saved versions retain separate snapshots until cleared.</w:t>
+        <w:t>Master and resume objects are plain serializable data. The blank factory returns empty strings and arrays. A readable upload saves without required applicant fields or section headings. Imports add source, importedText, importedFileName and formatting metadata. Clear Master Resume removes the unprotected master record and keeps only a content-free deletion flag, preventing history recovery. Protected storage writes a blank master snapshot. Saved versions retain separate snapshots until cleared.</w:t>
       </w:r>
     </w:p>
     <w:p>
@@ -2979,7 +2979,7 @@
     </w:p>
     <w:p>
       <w:r>
-        <w:t>The master dialog restores version 1 section grouping with read-only contact, summary, competencies, expandable experience, technical skills and education. showImportedText renders escaped facts and bullets, plus the original-text disclosure. The native picker remains the only source input. There is no master form, manual Save or Add/Remove handler. buildEditor and collectEditor are used only for tailored output. Source corrections happen in the original file and are uploaded again. Clear cancels pending reads and resets all displayed data before awaiting storage. keepMasterOpen leaves the empty dialog visible. A blank marker replaces saved master facts and filename history; encrypted storage writes the blank snapshot. masterDeletionFailed enables retry after a failed write. Storage events invalidate a cleared master in other tabs.</w:t>
+        <w:t>The master dialog restores version 1 section grouping with read-only contact, summary, competencies, a separate expanded section for every detected role, technical skills and education. showImportedText renders escaped facts and bullets, plus the original-text disclosure. The native picker remains the only source input. There is no master form, manual Save or Add/Remove handler. buildEditor and collectEditor are used only for tailored output. Source corrections happen in the original file and are uploaded again. Clear cancels pending reads and resets all displayed data before awaiting storage. keepMasterOpen leaves the empty dialog visible. deleteStoredMaster removes the master key after saving a boolean deletion flag; encrypted storage writes a blank snapshot. The direct click avoids native confirm dialogs that embedded browsers may suppress. masterDeletionFailed enables retry after a failed write. Storage events invalidate a cleared master in other tabs.</w:t>
       </w:r>
     </w:p>
     <w:p>
@@ -3176,7 +3176,7 @@
                 <w:color w:val="000000"/>
                 <w:sz w:val="21"/>
               </w:rPr>
-              <w:t>Saved master or an explicit Blank master resume marker. localStorage for this origin and browser profile.</w:t>
+              <w:t>Saved master in localStorage for this origin and browser profile. Clear removes this record, including imported text, filename and formatting.</w:t>
             </w:r>
           </w:p>
         </w:tc>
@@ -3404,7 +3404,7 @@
     </w:p>
     <w:p>
       <w:r>
-        <w:t>When protection is off, load a valid saved master or recover this browser’s history snapshot. An explicit blank marker prevents recovery after clearing. A protected workspace starts blank until unlocked. Master readiness controls tailoring; new browser profiles receive no applicant data.</w:t>
+        <w:t>When protection is off, load a valid saved master or recover this browser’s history snapshot. The boolean lw-resume-studio-master-cleared-v1 flag prevents recovery after clearing. Legacy blank markers remain supported. A protected workspace starts blank until unlocked. Master readiness controls tailoring; new browser profiles receive no applicant data.</w:t>
       </w:r>
     </w:p>
     <w:p>
@@ -3422,7 +3422,7 @@
     </w:p>
     <w:p>
       <w:r>
-        <w:t>Clear saved versions deletes the history key when unprotected, or awaits an encrypted empty-history write when protected. It clears memory, output, editors and prepared links, cancels pending work and reports persistence failures. Clear Master Resume stores a blank source and keeps history. Other-tab storage changes invalidate stale copies.</w:t>
+        <w:t>Clear saved versions deletes the history key when unprotected, or awaits an encrypted empty-history write when protected. It clears memory, output, editors and prepared links, cancels pending work and reports persistence failures. Clear Master Resume deletes the source record, or saves an encrypted blank master, and keeps application history. Other-tab storage changes invalidate stale copies.</w:t>
       </w:r>
     </w:p>
     <w:p>
@@ -3533,7 +3533,7 @@
     </w:p>
     <w:p>
       <w:r>
-        <w:t>The master review and deletion release passed 132 node:test checks on October 14 2026. Tests cover tailoring evidence, both document scores, English rules, actual export bytes, transfers, save failures, history deletion, reset guards, keyboard semantics, capability fallbacks, and seven fresh-master journeys. DOM adapters and capability simulations do not substitute for browser rendering or real ATS uploads.</w:t>
+        <w:t>The master review and deletion release passed 133 node:test checks on October 14 2026. Tests cover tailoring evidence, both document scores, English rules, actual export bytes, transfers, save failures, history deletion, reset guards, keyboard semantics, capability fallbacks, and seven fresh-master journeys. DOM adapters and capability simulations do not substitute for browser rendering or real ATS uploads.</w:t>
       </w:r>
     </w:p>
     <w:p>

</xml_diff>

<commit_message>
Release version 22: retain every source job and enforce truthful keyword evidence
</commit_message>
<xml_diff>
--- a/docs/Le_Resume_Studio_Developer_Guide.docx
+++ b/docs/Le_Resume_Studio_Developer_Guide.docx
@@ -20,7 +20,7 @@
     </w:p>
     <w:p>
       <w:r>
-        <w:t>October 14 2026  |  Published app version 21</w:t>
+        <w:t>October 14 2026  |  Published app version 22</w:t>
       </w:r>
     </w:p>
     <w:p>
@@ -1980,7 +1980,7 @@
                 <w:color w:val="000000"/>
                 <w:sz w:val="21"/>
               </w:rPr>
-              <w:t>id, createdAt, resume, master, jd, title, company, length, extra, ats, keywords, changes, englishCorrections, writingProfile, coverLetter, audit, coverAudit, review.</w:t>
+              <w:t>id, createdAt, resume, master, jd, title, company, length, extra, ats, keywords, changes, englishCorrections, writingProfile, coverLetter, audit, coverAudit, employmentAudit, review.</w:t>
             </w:r>
           </w:p>
         </w:tc>
@@ -2233,7 +2233,7 @@
     </w:p>
     <w:p>
       <w:r>
-        <w:t>Parsing recognizes common sections and confirmed three-field employment headings. Word numbering preserves bullet markers; PDF text is ordered by row and horizontal position. Until a complete next heading is confirmed, text remains with the current role, including its final accomplishment. headerOrder preserves role, employer and date order. Readable uploads save automatically even with missing facts or headings. Unreadable or invalid files preserve the prior source. Roles without bullets do not produce accomplishment paragraphs in the cover letter.</w:t>
+        <w:t>Parsing recognizes common sections and confirmed three-field employment headings, including role/company and date split across two lines, company/date followed by title, and role at company followed by dates. Word numbering preserves bullet markers; PDF text is ordered by row and horizontal position. Until a complete next heading is confirmed, text remains with the current role, including its final accomplishment. headerOrder preserves role, employer and date order. Readable uploads save automatically even with missing facts or headings. Unreadable or invalid files preserve the prior source. Roles without bullets do not produce accomplishment paragraphs in the cover letter.</w:t>
       </w:r>
     </w:p>
     <w:p>
@@ -2305,6 +2305,8 @@
       <w:r>
         <w:t>extractKeywords(jd, master, extra = "") -&gt; Keyword[]</w:t>
         <w:br/>
+        <w:t>auditEmploymentHistory(resume, master) -&gt; {expected, retained, complete}</w:t>
+        <w:br/>
         <w:t>auditResume(resume, keywords, master) -&gt; Audit</w:t>
         <w:br/>
         <w:t>auditCoverLetter(letter, keywords) -&gt; Audit</w:t>
@@ -2316,7 +2318,7 @@
     </w:p>
     <w:p>
       <w:r>
-        <w:t>Detection combines a finite catalog with named-tool and stated-skill detection. Additional comma-separated terms help recover missed phrases. Catalog concepts can have multiple employer aliases; every unique normalized job phrase is scored. Additional terms absent from the posting are excluded from the denominator. Resume evidence controls support; typing an unsupported term into the output cannot create evidence.</w:t>
+        <w:t>Detection uses a finite catalog, named tools and stated skills. affirmativeMention excludes recognized negated experience and learning goals. Qualification fields supply evidence; employer names and contacts do not. Separate affirmative evidence can support a skill. Additional comma-separated terms recover missed phrases. Unique normalized job phrases are scored, excluding extras absent from the posting. Typing unsupported wording into the output cannot create evidence.</w:t>
       </w:r>
     </w:p>
     <w:p>
@@ -2346,7 +2348,7 @@
     </w:p>
     <w:p>
       <w:r>
-        <w:t>The engine detects phrases, checks evidence, focuses the summary, moves relevant competencies first, ranks bullets within each role, rewrites equivalent supported wording, orders skills, inserts missing supported phrases, polishes English, creates the letter, and audits both documents. Original employers, titles, dates, metrics, and qualifications are preserved. Support work must retain its responsibility level.</w:t>
+        <w:t>The engine checks evidence, focuses the summary, prioritizes competencies and bullets, rewrites equivalent wording, polishes English and creates both documents. Both length options retain every parsed job in source order. auditEmploymentHistory checks count, titles, companies and dates; generation rejects incomplete retention and the preview reports retained jobs. Existing metrics and qualifications are preserved. Summaries do not invent professional titles from keyword themes, and support work retains its responsibility level.</w:t>
       </w:r>
     </w:p>
     <w:p>
@@ -2356,7 +2358,7 @@
     </w:p>
     <w:p>
       <w:r>
-        <w:t>writing.js exposes polishResume, polishCoverLetter, cleanEnglish, polishBullet, actionVerb, firstPersonBullet, and writingReview. The HR profile models a hiring reviewer with over twenty years of experience as an editorial lens. It neither adds that tenure to the applicant nor performs human review. Grammar rules are conservative; unrecognized openings and long sentences remain review items.</w:t>
+        <w:t>writing.js exports polishResume, polishCoverLetter, cleanEnglish, polishBullet, actionVerb, firstPersonBullet and writingReview. The HR perspective is an editorial lens, not applicant tenure or human review. Grammar checks are conservative; unrecognized openings and long sentences require review.</w:t>
       </w:r>
     </w:p>
     <w:p>
@@ -3533,7 +3535,7 @@
     </w:p>
     <w:p>
       <w:r>
-        <w:t>The master review and deletion release passed 133 node:test checks on October 14 2026. Tests cover tailoring evidence, both document scores, English rules, actual export bytes, transfers, save failures, history deletion, reset guards, keyboard semantics, capability fallbacks, and seven fresh-master journeys. DOM adapters and capability simulations do not substitute for browser rendering or real ATS uploads.</w:t>
+        <w:t>The job retention and truthful keyword release passed 138 node:test checks on October 14 2026. Tests cover tailoring evidence, both document scores, English rules, actual export bytes, transfers, save failures, history deletion, reset guards, keyboard semantics, capability fallbacks, and seven fresh-master journeys. DOM adapters and capability simulations do not substitute for browser rendering or real ATS uploads.</w:t>
       </w:r>
     </w:p>
     <w:p>

</xml_diff>